<commit_message>
Auto commit (2026-10-19 01:02) — 4 changes
Claude Code 세션 종료 시 자동 커밋.

Co-Authored-By: Claude <noreply@anthropic.com>
Claude-Session: https://claude.ai/code/501152ce-72bd-4883-a681-7c7ba6b279d3
</commit_message>
<xml_diff>
--- a/projects/45_horror_game_hottie/reference/Horror Game_ She’s a Monster, I See a Hottie.原作剧本_CN.docx
+++ b/projects/45_horror_game_hottie/reference/Horror Game_ She’s a Monster, I See a Hottie.原作剧本_CN.docx
@@ -45,6 +45,7 @@
     </w:p>
     <w:p>
       <w:pPr>
+        <w:keepNext/>
         <w:spacing w:after="40" w:before="160"/>
       </w:pPr>
       <w:r>
@@ -176,6 +177,7 @@
     </w:p>
     <w:p>
       <w:pPr>
+        <w:keepNext/>
         <w:spacing w:after="40" w:before="160"/>
       </w:pPr>
       <w:r>
@@ -378,6 +380,7 @@
     </w:p>
     <w:p>
       <w:pPr>
+        <w:keepNext/>
         <w:spacing w:after="40" w:before="160"/>
       </w:pPr>
       <w:r>
@@ -1627,6 +1630,7 @@
     </w:p>
     <w:p>
       <w:pPr>
+        <w:keepNext/>
         <w:spacing w:after="40" w:before="160"/>
       </w:pPr>
       <w:r>
@@ -2048,6 +2052,7 @@
     </w:p>
     <w:p>
       <w:pPr>
+        <w:keepNext/>
         <w:spacing w:after="40" w:before="160"/>
       </w:pPr>
       <w:r>
@@ -2262,6 +2267,7 @@
     </w:p>
     <w:p>
       <w:pPr>
+        <w:keepNext/>
         <w:spacing w:after="40" w:before="160"/>
       </w:pPr>
       <w:r>
@@ -2385,6 +2391,7 @@
     </w:p>
     <w:p>
       <w:pPr>
+        <w:keepNext/>
         <w:spacing w:after="40" w:before="160"/>
       </w:pPr>
       <w:r>
@@ -3090,6 +3097,7 @@
     </w:p>
     <w:p>
       <w:pPr>
+        <w:keepNext/>
         <w:spacing w:after="40" w:before="160"/>
       </w:pPr>
       <w:r>
@@ -3928,6 +3936,7 @@
     </w:p>
     <w:p>
       <w:pPr>
+        <w:keepNext/>
         <w:spacing w:after="40" w:before="160"/>
       </w:pPr>
       <w:r>
@@ -4038,6 +4047,7 @@
     </w:p>
     <w:p>
       <w:pPr>
+        <w:keepNext/>
         <w:spacing w:after="40" w:before="160"/>
       </w:pPr>
       <w:r>
@@ -4184,6 +4194,7 @@
     </w:p>
     <w:p>
       <w:pPr>
+        <w:keepNext/>
         <w:spacing w:after="40" w:before="160"/>
       </w:pPr>
       <w:r>
@@ -4291,6 +4302,7 @@
     </w:p>
     <w:p>
       <w:pPr>
+        <w:keepNext/>
         <w:spacing w:after="40" w:before="160"/>
       </w:pPr>
       <w:r>
@@ -4359,6 +4371,7 @@
     </w:p>
     <w:p>
       <w:pPr>
+        <w:keepNext/>
         <w:spacing w:after="40" w:before="160"/>
       </w:pPr>
       <w:r>
@@ -5002,6 +5015,7 @@
     </w:p>
     <w:p>
       <w:pPr>
+        <w:keepNext/>
         <w:spacing w:after="40" w:before="160"/>
       </w:pPr>
       <w:r>
@@ -5056,6 +5070,7 @@
     </w:p>
     <w:p>
       <w:pPr>
+        <w:keepNext/>
         <w:spacing w:after="40" w:before="160"/>
       </w:pPr>
       <w:r>
@@ -5515,6 +5530,7 @@
     </w:p>
     <w:p>
       <w:pPr>
+        <w:keepNext/>
         <w:spacing w:after="40" w:before="160"/>
       </w:pPr>
       <w:r>
@@ -6150,6 +6166,7 @@
     </w:p>
     <w:p>
       <w:pPr>
+        <w:keepNext/>
         <w:spacing w:after="40" w:before="160"/>
       </w:pPr>
       <w:r>
@@ -6621,6 +6638,7 @@
     </w:p>
     <w:p>
       <w:pPr>
+        <w:keepNext/>
         <w:spacing w:after="40" w:before="160"/>
       </w:pPr>
       <w:r>
@@ -6689,6 +6707,7 @@
     </w:p>
     <w:p>
       <w:pPr>
+        <w:keepNext/>
         <w:spacing w:after="40" w:before="160"/>
       </w:pPr>
       <w:r>
@@ -6785,6 +6804,7 @@
     </w:p>
     <w:p>
       <w:pPr>
+        <w:keepNext/>
         <w:spacing w:after="40" w:before="160"/>
       </w:pPr>
       <w:r>
@@ -7108,6 +7128,7 @@
     </w:p>
     <w:p>
       <w:pPr>
+        <w:keepNext/>
         <w:spacing w:after="40" w:before="160"/>
       </w:pPr>
       <w:r>
@@ -7216,6 +7237,7 @@
     </w:p>
     <w:p>
       <w:pPr>
+        <w:keepNext/>
         <w:spacing w:after="40" w:before="160"/>
       </w:pPr>
       <w:r>
@@ -7270,6 +7292,7 @@
     </w:p>
     <w:p>
       <w:pPr>
+        <w:keepNext/>
         <w:spacing w:after="40" w:before="160"/>
       </w:pPr>
       <w:r>
@@ -7617,6 +7640,7 @@
     </w:p>
     <w:p>
       <w:pPr>
+        <w:keepNext/>
         <w:spacing w:after="40" w:before="160"/>
       </w:pPr>
       <w:r>
@@ -7672,6 +7696,7 @@
     </w:p>
     <w:p>
       <w:pPr>
+        <w:keepNext/>
         <w:spacing w:after="40" w:before="160"/>
       </w:pPr>
       <w:r>
@@ -8076,6 +8101,7 @@
     </w:p>
     <w:p>
       <w:pPr>
+        <w:keepNext/>
         <w:spacing w:after="40" w:before="160"/>
       </w:pPr>
       <w:r>
@@ -8320,6 +8346,7 @@
     </w:p>
     <w:p>
       <w:pPr>
+        <w:keepNext/>
         <w:spacing w:after="40" w:before="160"/>
       </w:pPr>
       <w:r>
@@ -8415,6 +8442,7 @@
     </w:p>
     <w:p>
       <w:pPr>
+        <w:keepNext/>
         <w:spacing w:after="40" w:before="160"/>
       </w:pPr>
       <w:r>
@@ -8688,6 +8716,7 @@
     </w:p>
     <w:p>
       <w:pPr>
+        <w:keepNext/>
         <w:spacing w:after="40" w:before="160"/>
       </w:pPr>
       <w:r>
@@ -9596,6 +9625,7 @@
     </w:p>
     <w:p>
       <w:pPr>
+        <w:keepNext/>
         <w:spacing w:after="40" w:before="160"/>
       </w:pPr>
       <w:r>
@@ -9719,6 +9749,7 @@
     </w:p>
     <w:p>
       <w:pPr>
+        <w:keepNext/>
         <w:spacing w:after="40" w:before="160"/>
       </w:pPr>
       <w:r>
@@ -10288,6 +10319,7 @@
     </w:p>
     <w:p>
       <w:pPr>
+        <w:keepNext/>
         <w:spacing w:after="40" w:before="160"/>
       </w:pPr>
       <w:r>
@@ -11023,6 +11055,7 @@
     </w:p>
     <w:p>
       <w:pPr>
+        <w:keepNext/>
         <w:spacing w:after="40" w:before="160"/>
       </w:pPr>
       <w:r>
@@ -11293,6 +11326,7 @@
     </w:p>
     <w:p>
       <w:pPr>
+        <w:keepNext/>
         <w:spacing w:after="40" w:before="160"/>
       </w:pPr>
       <w:r>
@@ -11360,6 +11394,7 @@
     </w:p>
     <w:p>
       <w:pPr>
+        <w:keepNext/>
         <w:spacing w:after="40" w:before="160"/>
       </w:pPr>
       <w:r>
@@ -11657,6 +11692,7 @@
     </w:p>
     <w:p>
       <w:pPr>
+        <w:keepNext/>
         <w:spacing w:after="40" w:before="160"/>
       </w:pPr>
       <w:r>
@@ -12108,6 +12144,7 @@
     </w:p>
     <w:p>
       <w:pPr>
+        <w:keepNext/>
         <w:spacing w:after="40" w:before="160"/>
       </w:pPr>
       <w:r>
@@ -12724,6 +12761,7 @@
     </w:p>
     <w:p>
       <w:pPr>
+        <w:keepNext/>
         <w:spacing w:after="40" w:before="160"/>
       </w:pPr>
       <w:r>
@@ -13274,6 +13312,7 @@
     </w:p>
     <w:p>
       <w:pPr>
+        <w:keepNext/>
         <w:spacing w:after="40" w:before="160"/>
       </w:pPr>
       <w:r>
@@ -13719,6 +13758,7 @@
     </w:p>
     <w:p>
       <w:pPr>
+        <w:keepNext/>
         <w:spacing w:after="40" w:before="160"/>
       </w:pPr>
       <w:r>
@@ -13989,6 +14029,7 @@
     </w:p>
     <w:p>
       <w:pPr>
+        <w:keepNext/>
         <w:spacing w:after="40" w:before="160"/>
       </w:pPr>
       <w:r>
@@ -14558,6 +14599,7 @@
     </w:p>
     <w:p>
       <w:pPr>
+        <w:keepNext/>
         <w:spacing w:after="40" w:before="160"/>
       </w:pPr>
       <w:r>
@@ -15028,6 +15070,7 @@
     </w:p>
     <w:p>
       <w:pPr>
+        <w:keepNext/>
         <w:spacing w:after="40" w:before="160"/>
       </w:pPr>
       <w:r>
@@ -15484,6 +15527,7 @@
     </w:p>
     <w:p>
       <w:pPr>
+        <w:keepNext/>
         <w:spacing w:after="40" w:before="160"/>
       </w:pPr>
       <w:r>
@@ -15754,6 +15798,7 @@
     </w:p>
     <w:p>
       <w:pPr>
+        <w:keepNext/>
         <w:spacing w:after="40" w:before="160"/>
       </w:pPr>
       <w:r>
@@ -15835,6 +15880,7 @@
     </w:p>
     <w:p>
       <w:pPr>
+        <w:keepNext/>
         <w:spacing w:after="40" w:before="160"/>
       </w:pPr>
       <w:r>
@@ -15998,6 +16044,7 @@
     </w:p>
     <w:p>
       <w:pPr>
+        <w:keepNext/>
         <w:spacing w:after="40" w:before="160"/>
       </w:pPr>
       <w:r>
@@ -16256,6 +16303,7 @@
     </w:p>
     <w:p>
       <w:pPr>
+        <w:keepNext/>
         <w:spacing w:after="40" w:before="160"/>
       </w:pPr>
       <w:r>
@@ -16578,6 +16626,7 @@
     </w:p>
     <w:p>
       <w:pPr>
+        <w:keepNext/>
         <w:spacing w:after="40" w:before="160"/>
       </w:pPr>
       <w:r>
@@ -16646,6 +16695,7 @@
     </w:p>
     <w:p>
       <w:pPr>
+        <w:keepNext/>
         <w:spacing w:after="40" w:before="160"/>
       </w:pPr>
       <w:r>
@@ -16700,6 +16750,7 @@
     </w:p>
     <w:p>
       <w:pPr>
+        <w:keepNext/>
         <w:spacing w:after="40" w:before="160"/>
       </w:pPr>
       <w:r>
@@ -16917,6 +16968,7 @@
     </w:p>
     <w:p>
       <w:pPr>
+        <w:keepNext/>
         <w:spacing w:after="40" w:before="160"/>
       </w:pPr>
       <w:r>
@@ -16971,6 +17023,7 @@
     </w:p>
     <w:p>
       <w:pPr>
+        <w:keepNext/>
         <w:spacing w:after="40" w:before="160"/>
       </w:pPr>
       <w:r>
@@ -17190,6 +17243,7 @@
     </w:p>
     <w:p>
       <w:pPr>
+        <w:keepNext/>
         <w:spacing w:after="40" w:before="160"/>
       </w:pPr>
       <w:r>
@@ -17257,6 +17311,7 @@
     </w:p>
     <w:p>
       <w:pPr>
+        <w:keepNext/>
         <w:spacing w:after="40" w:before="160"/>
       </w:pPr>
       <w:r>
@@ -17485,6 +17540,7 @@
     </w:p>
     <w:p>
       <w:pPr>
+        <w:keepNext/>
         <w:spacing w:after="40" w:before="160"/>
       </w:pPr>
       <w:r>
@@ -17566,6 +17622,7 @@
     </w:p>
     <w:p>
       <w:pPr>
+        <w:keepNext/>
         <w:spacing w:after="40" w:before="160"/>
       </w:pPr>
       <w:r>
@@ -17621,6 +17678,7 @@
     </w:p>
     <w:p>
       <w:pPr>
+        <w:keepNext/>
         <w:spacing w:after="40" w:before="160"/>
       </w:pPr>
       <w:r>
@@ -17838,6 +17896,7 @@
     </w:p>
     <w:p>
       <w:pPr>
+        <w:keepNext/>
         <w:spacing w:after="40" w:before="160"/>
       </w:pPr>
       <w:r>
@@ -18283,6 +18342,7 @@
     </w:p>
     <w:p>
       <w:pPr>
+        <w:keepNext/>
         <w:spacing w:after="40" w:before="160"/>
       </w:pPr>
       <w:r>
@@ -18446,6 +18506,7 @@
     </w:p>
     <w:p>
       <w:pPr>
+        <w:keepNext/>
         <w:spacing w:after="40" w:before="160"/>
       </w:pPr>
       <w:r>
@@ -18663,6 +18724,7 @@
     </w:p>
     <w:p>
       <w:pPr>
+        <w:keepNext/>
         <w:spacing w:after="40" w:before="160"/>
       </w:pPr>
       <w:r>
@@ -18785,6 +18847,7 @@
     </w:p>
     <w:p>
       <w:pPr>
+        <w:keepNext/>
         <w:spacing w:after="40" w:before="160"/>
       </w:pPr>
       <w:r>
@@ -18948,6 +19011,7 @@
     </w:p>
     <w:p>
       <w:pPr>
+        <w:keepNext/>
         <w:spacing w:after="40" w:before="160"/>
       </w:pPr>
       <w:r>
@@ -19030,6 +19094,7 @@
     </w:p>
     <w:p>
       <w:pPr>
+        <w:keepNext/>
         <w:spacing w:after="40" w:before="160"/>
       </w:pPr>
       <w:r>
@@ -19233,6 +19298,7 @@
     </w:p>
     <w:p>
       <w:pPr>
+        <w:keepNext/>
         <w:spacing w:after="40" w:before="160"/>
       </w:pPr>
       <w:r>
@@ -19439,6 +19505,7 @@
     </w:p>
     <w:p>
       <w:pPr>
+        <w:keepNext/>
         <w:spacing w:after="40" w:before="160"/>
       </w:pPr>
       <w:r>
@@ -19480,6 +19547,7 @@
     </w:p>
     <w:p>
       <w:pPr>
+        <w:keepNext/>
         <w:spacing w:after="40" w:before="160"/>
       </w:pPr>
       <w:r>
@@ -19602,6 +19670,7 @@
     </w:p>
     <w:p>
       <w:pPr>
+        <w:keepNext/>
         <w:spacing w:after="40" w:before="160"/>
       </w:pPr>
       <w:r>
@@ -19685,6 +19754,7 @@
     </w:p>
     <w:p>
       <w:pPr>
+        <w:keepNext/>
         <w:spacing w:after="40" w:before="160"/>
       </w:pPr>
       <w:r>
@@ -19753,6 +19823,7 @@
     </w:p>
     <w:p>
       <w:pPr>
+        <w:keepNext/>
         <w:spacing w:after="40" w:before="160"/>
       </w:pPr>
       <w:r>
@@ -20077,6 +20148,7 @@
     </w:p>
     <w:p>
       <w:pPr>
+        <w:keepNext/>
         <w:spacing w:after="40" w:before="160"/>
       </w:pPr>
       <w:r>
@@ -20403,6 +20475,7 @@
     </w:p>
     <w:p>
       <w:pPr>
+        <w:keepNext/>
         <w:spacing w:after="40" w:before="160"/>
       </w:pPr>
       <w:r>
@@ -20675,6 +20748,7 @@
     </w:p>
     <w:p>
       <w:pPr>
+        <w:keepNext/>
         <w:spacing w:after="40" w:before="160"/>
       </w:pPr>
       <w:r>
@@ -21042,6 +21116,7 @@
     </w:p>
     <w:p>
       <w:pPr>
+        <w:keepNext/>
         <w:spacing w:after="40" w:before="160"/>
       </w:pPr>
       <w:r>
@@ -21365,6 +21440,7 @@
     </w:p>
     <w:p>
       <w:pPr>
+        <w:keepNext/>
         <w:spacing w:after="40" w:before="160"/>
       </w:pPr>
       <w:r>
@@ -21864,6 +21940,7 @@
     </w:p>
     <w:p>
       <w:pPr>
+        <w:keepNext/>
         <w:spacing w:after="40" w:before="160"/>
       </w:pPr>
       <w:r>
@@ -21932,6 +22009,7 @@
     </w:p>
     <w:p>
       <w:pPr>
+        <w:keepNext/>
         <w:spacing w:after="40" w:before="160"/>
       </w:pPr>
       <w:r>
@@ -22098,6 +22176,7 @@
     </w:p>
     <w:p>
       <w:pPr>
+        <w:keepNext/>
         <w:spacing w:after="40" w:before="160"/>
       </w:pPr>
       <w:r>
@@ -22192,6 +22271,7 @@
     </w:p>
     <w:p>
       <w:pPr>
+        <w:keepNext/>
         <w:spacing w:after="40" w:before="160"/>
       </w:pPr>
       <w:r>
@@ -22436,6 +22516,7 @@
     </w:p>
     <w:p>
       <w:pPr>
+        <w:keepNext/>
         <w:spacing w:after="40" w:before="160"/>
       </w:pPr>
       <w:r>
@@ -22560,6 +22641,7 @@
     </w:p>
     <w:p>
       <w:pPr>
+        <w:keepNext/>
         <w:spacing w:after="40" w:before="160"/>
       </w:pPr>
       <w:r>
@@ -22779,6 +22861,7 @@
     </w:p>
     <w:p>
       <w:pPr>
+        <w:keepNext/>
         <w:spacing w:after="40" w:before="160"/>
       </w:pPr>
       <w:r>
@@ -23052,6 +23135,7 @@
     </w:p>
     <w:p>
       <w:pPr>
+        <w:keepNext/>
         <w:spacing w:after="40" w:before="160"/>
       </w:pPr>
       <w:r>
@@ -23186,6 +23270,7 @@
     </w:p>
     <w:p>
       <w:pPr>
+        <w:keepNext/>
         <w:spacing w:after="40" w:before="160"/>
       </w:pPr>
       <w:r>
@@ -23484,6 +23569,7 @@
     </w:p>
     <w:p>
       <w:pPr>
+        <w:keepNext/>
         <w:spacing w:after="40" w:before="160"/>
       </w:pPr>
       <w:r>
@@ -23633,6 +23719,7 @@
     </w:p>
     <w:p>
       <w:pPr>
+        <w:keepNext/>
         <w:spacing w:after="40" w:before="160"/>
       </w:pPr>
       <w:r>
@@ -23796,6 +23883,7 @@
     </w:p>
     <w:p>
       <w:pPr>
+        <w:keepNext/>
         <w:spacing w:after="40" w:before="160"/>
       </w:pPr>
       <w:r>
@@ -23892,6 +23980,7 @@
     </w:p>
     <w:p>
       <w:pPr>
+        <w:keepNext/>
         <w:spacing w:after="40" w:before="160"/>
       </w:pPr>
       <w:r>
@@ -24206,6 +24295,7 @@
     </w:p>
     <w:p>
       <w:pPr>
+        <w:keepNext/>
         <w:spacing w:after="40" w:before="160"/>
       </w:pPr>
       <w:r>
@@ -24453,6 +24543,7 @@
     </w:p>
     <w:p>
       <w:pPr>
+        <w:keepNext/>
         <w:spacing w:after="40" w:before="160"/>
       </w:pPr>
       <w:r>

</xml_diff>

<commit_message>
Auto commit (2026-10-19 01:16) — 2 changes
Claude Code 세션 종료 시 자동 커밋.

Co-Authored-By: Claude <noreply@anthropic.com>
Claude-Session: https://claude.ai/code/e04ac5bc-1fb1-4b28-b40a-be63e6103fc8
</commit_message>
<xml_diff>
--- a/projects/45_horror_game_hottie/reference/Horror Game_ She’s a Monster, I See a Hottie.原作剧本_CN.docx
+++ b/projects/45_horror_game_hottie/reference/Horror Game_ She’s a Monster, I See a Hottie.原作剧本_CN.docx
@@ -67,20 +67,20 @@
           <w:b w:val="0"/>
           <w:sz w:val="20"/>
         </w:rPr>
-        <w:t>· 亚瑟·埃文斯：男主。和一群宾客一起被拖进雷文希尔庄园的"血之婚礼"死亡游戏。只有他看到的新娘是美女，也只有他获得恋爱逃脱系统（新娘好感度满100即可逃脱）。</w:t>
-      </w:r>
-    </w:p>
-    <w:p>
-      <w:pPr>
-        <w:spacing w:after="60" w:before="0"/>
-      </w:pPr>
-      <w:r>
-        <w:rPr>
-          <w:rFonts w:ascii="Microsoft YaHei" w:hAnsi="Microsoft YaHei" w:eastAsia="Microsoft YaHei"/>
-          <w:b w:val="0"/>
-          <w:sz w:val="20"/>
-        </w:rPr>
-        <w:t>· 莉莉丝·莫里安：血之新娘。别人眼中是浑身是血的怪物新娘，亚瑟眼中是美女。</w:t>
+        <w:t>· 亚瑟·埃文斯（Arthur Evans）：男主。和一群宾客一起被拖进雷文希尔（Ravenhill）庄园的"血之婚礼"死亡游戏。只有他看到的新娘是美女，也只有他获得恋爱逃脱系统（新娘好感度满100即可逃脱）。</w:t>
+      </w:r>
+    </w:p>
+    <w:p>
+      <w:pPr>
+        <w:spacing w:after="60" w:before="0"/>
+      </w:pPr>
+      <w:r>
+        <w:rPr>
+          <w:rFonts w:ascii="Microsoft YaHei" w:hAnsi="Microsoft YaHei" w:eastAsia="Microsoft YaHei"/>
+          <w:b w:val="0"/>
+          <w:sz w:val="20"/>
+        </w:rPr>
+        <w:t>· 莉莉丝·莫里安（Lilith Morian）：血之新娘。别人眼中是浑身是血的怪物新娘，亚瑟眼中是美女。</w:t>
       </w:r>
     </w:p>
     <w:p>
@@ -106,46 +106,46 @@
           <w:b w:val="0"/>
           <w:sz w:val="20"/>
         </w:rPr>
-        <w:t>· 杰克：红发男宾客，处处跟亚瑟作对（第11集在投票中输掉）。</w:t>
-      </w:r>
-    </w:p>
-    <w:p>
-      <w:pPr>
-        <w:spacing w:after="60" w:before="0"/>
-      </w:pPr>
-      <w:r>
-        <w:rPr>
-          <w:rFonts w:ascii="Microsoft YaHei" w:hAnsi="Microsoft YaHei" w:eastAsia="Microsoft YaHei"/>
-          <w:b w:val="0"/>
-          <w:sz w:val="20"/>
-        </w:rPr>
-        <w:t>· 亚历山大：亚瑟的朋友，第15集起在婚礼中出现。</w:t>
-      </w:r>
-    </w:p>
-    <w:p>
-      <w:pPr>
-        <w:spacing w:after="60" w:before="0"/>
-      </w:pPr>
-      <w:r>
-        <w:rPr>
-          <w:rFonts w:ascii="Microsoft YaHei" w:hAnsi="Microsoft YaHei" w:eastAsia="Microsoft YaHei"/>
-          <w:b w:val="0"/>
-          <w:sz w:val="20"/>
-        </w:rPr>
-        <w:t>· 奥德里克·雷文希尔：第24集起登场的黑大衣男人。</w:t>
-      </w:r>
-    </w:p>
-    <w:p>
-      <w:pPr>
-        <w:spacing w:after="60" w:before="0"/>
-      </w:pPr>
-      <w:r>
-        <w:rPr>
-          <w:rFonts w:ascii="Microsoft YaHei" w:hAnsi="Microsoft YaHei" w:eastAsia="Microsoft YaHei"/>
-          <w:b w:val="0"/>
-          <w:sz w:val="20"/>
-        </w:rPr>
-        <w:t>· 伊芙琳：第26集起的死亡重置循环里的关键宾客。</w:t>
+        <w:t>· 杰克（Jack）：红发男宾客，处处跟亚瑟作对（第11集在投票中输掉）。</w:t>
+      </w:r>
+    </w:p>
+    <w:p>
+      <w:pPr>
+        <w:spacing w:after="60" w:before="0"/>
+      </w:pPr>
+      <w:r>
+        <w:rPr>
+          <w:rFonts w:ascii="Microsoft YaHei" w:hAnsi="Microsoft YaHei" w:eastAsia="Microsoft YaHei"/>
+          <w:b w:val="0"/>
+          <w:sz w:val="20"/>
+        </w:rPr>
+        <w:t>· 亚历山大（Alexander）：亚瑟的朋友，第15集起在婚礼中出现。</w:t>
+      </w:r>
+    </w:p>
+    <w:p>
+      <w:pPr>
+        <w:spacing w:after="60" w:before="0"/>
+      </w:pPr>
+      <w:r>
+        <w:rPr>
+          <w:rFonts w:ascii="Microsoft YaHei" w:hAnsi="Microsoft YaHei" w:eastAsia="Microsoft YaHei"/>
+          <w:b w:val="0"/>
+          <w:sz w:val="20"/>
+        </w:rPr>
+        <w:t>· 奥德里克·雷文希尔（Aldrick Ravenhill）：第24集起登场的黑大衣男人。</w:t>
+      </w:r>
+    </w:p>
+    <w:p>
+      <w:pPr>
+        <w:spacing w:after="60" w:before="0"/>
+      </w:pPr>
+      <w:r>
+        <w:rPr>
+          <w:rFonts w:ascii="Microsoft YaHei" w:hAnsi="Microsoft YaHei" w:eastAsia="Microsoft YaHei"/>
+          <w:b w:val="0"/>
+          <w:sz w:val="20"/>
+        </w:rPr>
+        <w:t>· 伊芙琳（Evelyn）：第26集起的死亡重置循环里的关键宾客。</w:t>
       </w:r>
     </w:p>
     <w:p>

</xml_diff>